<commit_message>
Auto-fill meeting minutes figures and frame application form
Compute attending shareholder count and voting rights from the
shareholder list instead of placeholder marks, and drop the unknown
article number from the wording. Add a ruled title and a bordered box
around the registration matters in the application form.

Co-authored-by: Cursor <cursoragent@cursor.com>
</commit_message>
<xml_diff>
--- a/templates/application_new.docx
+++ b/templates/application_new.docx
@@ -4,6 +4,9 @@
   <w:body>
     <w:p>
       <w:pPr>
+        <w:pBdr>
+          <w:bottom w:val="single" w:sz="6" w:space="6" w:color="000000"/>
+        </w:pBdr>
         <w:jc w:val="center"/>
         <w:spacing w:before="0" w:after="240" w:line="300" w:lineRule="auto"/>
         <w:rPr>
@@ -97,7 +100,7 @@
     </w:p>
     <w:p>
       <w:pPr>
-        <w:spacing w:before="0" w:after="80" w:line="300" w:lineRule="auto"/>
+        <w:spacing w:before="0" w:after="60" w:line="300" w:lineRule="auto"/>
         <w:rPr>
           <w:rFonts w:ascii="Yu Mincho" w:eastAsia="游明朝" w:hAnsi="Yu Mincho"/>
           <w:sz w:val="21"/>
@@ -112,23 +115,62 @@
         <w:t xml:space="preserve">１　登記すべき事項</w:t>
       </w:r>
     </w:p>
-    <w:p>
-      <w:pPr>
-        <w:ind w:left="480"/>
-        <w:spacing w:before="0" w:after="120" w:line="300" w:lineRule="auto"/>
-        <w:rPr>
-          <w:rFonts w:ascii="Yu Mincho" w:eastAsia="游明朝" w:hAnsi="Yu Mincho"/>
-          <w:sz w:val="21"/>
-        </w:rPr>
-      </w:pPr>
-      <w:r>
-        <w:rPr>
-          <w:rFonts w:ascii="Yu Mincho" w:eastAsia="游明朝" w:hAnsi="Yu Mincho"/>
-          <w:sz w:val="21"/>
-          <w:szCs w:val="21"/>
-        </w:rPr>
-        <w:t xml:space="preserve">{registration_matters}</w:t>
-      </w:r>
+    <w:tbl>
+      <w:tblPr>
+        <w:tblW w:w="9070" w:type="dxa"/>
+        <w:jc w:val="center"/>
+        <w:tblBorders>
+          <w:top w:val="single" w:sz="4" w:space="0" w:color="000000"/>
+          <w:left w:val="single" w:sz="4" w:space="0" w:color="000000"/>
+          <w:bottom w:val="single" w:sz="4" w:space="0" w:color="000000"/>
+          <w:right w:val="single" w:sz="4" w:space="0" w:color="000000"/>
+          <w:insideH w:val="single" w:sz="4" w:space="0" w:color="000000"/>
+          <w:insideV w:val="single" w:sz="4" w:space="0" w:color="000000"/>
+        </w:tblBorders>
+        <w:tblLook w:val="04A0"/>
+      </w:tblPr>
+      <w:tblGrid>
+        <w:gridCol w:w="9070"/>
+      </w:tblGrid>
+      <w:tr>
+        <w:tc>
+          <w:tcPr>
+            <w:tcW w:w="9070" w:type="dxa"/>
+            <w:tcMar>
+              <w:top w:w="80" w:type="dxa"/>
+              <w:left w:w="160" w:type="dxa"/>
+              <w:bottom w:w="80" w:type="dxa"/>
+              <w:right w:w="160" w:type="dxa"/>
+            </w:tcMar>
+          </w:tcPr>
+          <w:p>
+            <w:pPr>
+              <w:spacing w:before="0" w:after="0" w:line="300" w:lineRule="auto"/>
+              <w:rPr>
+                <w:rFonts w:ascii="Yu Mincho" w:eastAsia="游明朝" w:hAnsi="Yu Mincho"/>
+                <w:sz w:val="21"/>
+              </w:rPr>
+            </w:pPr>
+            <w:r>
+              <w:rPr>
+                <w:rFonts w:ascii="Yu Mincho" w:eastAsia="游明朝" w:hAnsi="Yu Mincho"/>
+                <w:sz w:val="21"/>
+                <w:szCs w:val="21"/>
+              </w:rPr>
+              <w:t xml:space="preserve">{registration_matters}</w:t>
+            </w:r>
+          </w:p>
+        </w:tc>
+      </w:tr>
+    </w:tbl>
+    <w:p>
+      <w:pPr>
+        <w:spacing w:before="0" w:after="0" w:line="300" w:lineRule="auto"/>
+        <w:rPr>
+          <w:rFonts w:ascii="Yu Mincho" w:eastAsia="游明朝" w:hAnsi="Yu Mincho"/>
+          <w:sz w:val="21"/>
+        </w:rPr>
+      </w:pPr>
     </w:p>
     <w:p>
       <w:pPr>

</xml_diff>